<commit_message>
docs: actualiza la documentacion maestra al estado de julio 2026
- Actualiza PROYECTO-GEMELO-DIGITAL-COMPLETO.md: funcionalidades del
  dashboard docente y portal del estudiante rediseñados, repo de
  respaldo gemelo-digital-v2.0 y su flujo, endpoints nuevos
  (dropbox/folders, classlist con LastAccessed, content/consumption),
  stack frontend corregido (CSS-in-JS, Vitest) y nueva seccion 15 con el
  changelog de la sesion, entorno de desarrollo local y pendientes.
- Actualiza generate-docx.js (seccion 15.13, portada, seccion 1.1 y
  pendientes) y regenera Gemelo-Digital-Documentacion-Completa.docx.

Co-Authored-By: Claude Fable 5 <noreply@anthropic.com>
</commit_message>
<xml_diff>
--- a/docs/Gemelo-Digital-Documentacion-Completa.docx
+++ b/docs/Gemelo-Digital-Documentacion-Completa.docx
@@ -42,7 +42,7 @@
           <w:sz w:val="24"/>
           <w:szCs w:val="24"/>
         </w:rPr>
-        <w:t xml:space="preserve">Estado consolidado a junio de 2026</w:t>
+        <w:t xml:space="preserve">Estado consolidado a julio de 2026</w:t>
       </w:r>
     </w:p>
     <w:p>
@@ -268,7 +268,7 @@
         <w:spacing w:after="120"/>
       </w:pPr>
       <w:r>
-        <w:t xml:space="preserve">Junio de 2026. Última sesión de trabajo importante: integración de la arquitectura completa del colaborador (Juan David) con todas las features modernas (vista de estudiante, calendario, predicciones, alertas inteligentes, etc.) más nuestros aportes propios (refresh-token, fix de estudiantes fantasma, CI/CD vía GitHub Actions OIDC).</w:t>
+        <w:t xml:space="preserve">31 de julio de 2026. Última sesión de trabajo importante: rediseño completo del dashboard docente y del portal del estudiante con estilo de dashboard analítico (fila de KPIs, velocímetro de riesgo, panel de asignaciones, accesos al curso, consumo de contenidos), pestañas dedicadas para Estudiantes/Calendario/Tendencias, selector de estudiante en "Vista estudiante" para el superadmin, y nuevo repositorio de respaldo gemelo-digital-v2.0. Detalle en la sección 15.13. La sesión anterior (junio 2026) integró la arquitectura del colaborador (Juan David) + refresh-token, fix de estudiantes fantasma y CI/CD vía GitHub Actions OIDC.</w:t>
       </w:r>
     </w:p>
     <w:p>
@@ -21457,20 +21457,15 @@
       </w:tr>
     </w:tbl>
     <w:p>
-      <w:r>
-        <w:br w:type="page"/>
-      </w:r>
-    </w:p>
-    <w:p>
-      <w:pPr>
-        <w:pStyle w:val="Heading1"/>
+      <w:pPr>
+        <w:pStyle w:val="Heading2"/>
       </w:pPr>
       <w:r>
         <w:rPr>
           <w:b/>
           <w:bCs/>
         </w:rPr>
-        <w:t xml:space="preserve">16. Pendientes y siguientes pasos sugeridos</w:t>
+        <w:t xml:space="preserve">15.13 Rediseño de julio 2026 — dashboard, portal y nuevas métricas</w:t>
       </w:r>
     </w:p>
     <w:p>
@@ -21478,19 +21473,284 @@
         <w:spacing w:after="120"/>
       </w:pPr>
       <w:r>
-        <w:t xml:space="preserve">Lo que queda por hacer cuando se retome el proyecto.</w:t>
-      </w:r>
-    </w:p>
-    <w:p>
-      <w:pPr>
-        <w:pStyle w:val="Heading2"/>
+        <w:t xml:space="preserve">Sesión del 31 de julio de 2026. Los cambios se desarrollaron en la carpeta local clonada del repo de Juan David, se pushearon como ramas al repo principal (PR + merge a main con deploy automático) y se respaldaron en el repo nuevo JCortes87/gemelo-digital-v2.0 (sin CI/CD; solo respaldo/compartir).</w:t>
+      </w:r>
+    </w:p>
+    <w:p>
+      <w:pPr>
+        <w:pStyle w:val="Heading3"/>
       </w:pPr>
       <w:r>
         <w:rPr>
           <w:b/>
           <w:bCs/>
         </w:rPr>
+        <w:t xml:space="preserve">Dashboard docente</w:t>
+      </w:r>
+    </w:p>
+    <w:p>
+      <w:pPr>
+        <w:pStyle w:val="ListParagraph"/>
+        <w:numPr>
+          <w:ilvl w:val="0"/>
+          <w:numId w:val="2"/>
+        </w:numPr>
+      </w:pPr>
+      <w:r>
+        <w:t xml:space="preserve">Fila de 4 KPIs estilo tarjeta centrada: nota promedio (donut 0-10), estudiantes inscritos, en riesgo (alto+medio) y contenidos publicados vs mínimo esperado.</w:t>
+      </w:r>
+    </w:p>
+    <w:p>
+      <w:pPr>
+        <w:pStyle w:val="ListParagraph"/>
+        <w:numPr>
+          <w:ilvl w:val="0"/>
+          <w:numId w:val="2"/>
+        </w:numPr>
+      </w:pPr>
+      <w:r>
+        <w:t xml:space="preserve">Nuevo componente GaugeMeter (velocímetro semicircular con zonas verde/ámbar/rojo) para el riesgo académico.</w:t>
+      </w:r>
+    </w:p>
+    <w:p>
+      <w:pPr>
+        <w:pStyle w:val="ListParagraph"/>
+        <w:numPr>
+          <w:ilvl w:val="0"/>
+          <w:numId w:val="2"/>
+        </w:numPr>
+      </w:pPr>
+      <w:r>
+        <w:t xml:space="preserve">Fila de 4 tarjetas de igual altura: riesgo académico, distribución de notas, contenidos y cobertura, estudiantes prioritarios.</w:t>
+      </w:r>
+    </w:p>
+    <w:p>
+      <w:pPr>
+        <w:pStyle w:val="ListParagraph"/>
+        <w:numPr>
+          <w:ilvl w:val="0"/>
+          <w:numId w:val="2"/>
+        </w:numPr>
+      </w:pPr>
+      <w:r>
+        <w:t xml:space="preserve">Nuevo AssignmentsPanel: asignaciones creadas / con entregas (+% de entrega) / calificadas / vencidas, con listado detallado colapsable (usa /brightspace/.../dropbox/folders).</w:t>
+      </w:r>
+    </w:p>
+    <w:p>
+      <w:pPr>
+        <w:pStyle w:val="ListParagraph"/>
+        <w:numPr>
+          <w:ilvl w:val="0"/>
+          <w:numId w:val="2"/>
+        </w:numPr>
+      </w:pPr>
+      <w:r>
+        <w:t xml:space="preserve">Nueva tarjeta Accesos al curso: recencia del último acceso por estudiante (hoy / 7 días / +14 días / nunca) y top de desconectados, del LastAccessed del classlist.</w:t>
+      </w:r>
+    </w:p>
+    <w:p>
+      <w:pPr>
+        <w:pStyle w:val="ListParagraph"/>
+        <w:numPr>
+          <w:ilvl w:val="0"/>
+          <w:numId w:val="2"/>
+        </w:numPr>
+      </w:pPr>
+      <w:r>
+        <w:t xml:space="preserve">Contenidos y cobertura: sección renombrada a 'Contenidos del profesor', y nueva métrica 'Contenidos consumidos por estudiantes' (promedio de temas abiertos) vía endpoint nuevo /brightspace/course/{ou}/content/consumption.</w:t>
+      </w:r>
+    </w:p>
+    <w:p>
+      <w:pPr>
+        <w:pStyle w:val="ListParagraph"/>
+        <w:numPr>
+          <w:ilvl w:val="0"/>
+          <w:numId w:val="2"/>
+        </w:numPr>
+      </w:pPr>
+      <w:r>
+        <w:t xml:space="preserve">Pestañas nuevas en el sidebar: Estudiantes (tabla con columna 'Último acceso'), Calendario y Tendencias. Atajos 4/5/6 y paleta de comandos actualizados.</w:t>
+      </w:r>
+    </w:p>
+    <w:p>
+      <w:pPr>
+        <w:pStyle w:val="ListParagraph"/>
+        <w:numPr>
+          <w:ilvl w:val="0"/>
+          <w:numId w:val="2"/>
+        </w:numPr>
+      </w:pPr>
+      <w:r>
+        <w:t xml:space="preserve">Tarjetas con banda de encabezado (fondo suave, título centrado) e iconos por sección en toda el área docente.</w:t>
+      </w:r>
+    </w:p>
+    <w:p>
+      <w:pPr>
+        <w:pStyle w:val="ListParagraph"/>
+        <w:numPr>
+          <w:ilvl w:val="0"/>
+          <w:numId w:val="2"/>
+        </w:numPr>
+      </w:pPr>
+      <w:r>
+        <w:t xml:space="preserve">Fix: el dashboard abría en la pestaña Estudiantes al montar; la pestaña por defecto vuelve a ser Dashboard.</w:t>
+      </w:r>
+    </w:p>
+    <w:p>
+      <w:pPr>
+        <w:pStyle w:val="Heading3"/>
+      </w:pPr>
+      <w:r>
+        <w:rPr>
+          <w:b/>
+          <w:bCs/>
+        </w:rPr>
+        <w:t xml:space="preserve">Portal del estudiante</w:t>
+      </w:r>
+    </w:p>
+    <w:p>
+      <w:pPr>
+        <w:pStyle w:val="ListParagraph"/>
+        <w:numPr>
+          <w:ilvl w:val="0"/>
+          <w:numId w:val="2"/>
+        </w:numPr>
+      </w:pPr>
+      <w:r>
+        <w:t xml:space="preserve">KPIs rediseñados al mismo estilo: mi nota actual, asignaciones calificadas (nuevo, con pendientes y vencidas), cobertura y mi estado.</w:t>
+      </w:r>
+    </w:p>
+    <w:p>
+      <w:pPr>
+        <w:pStyle w:val="ListParagraph"/>
+        <w:numPr>
+          <w:ilvl w:val="0"/>
+          <w:numId w:val="2"/>
+        </w:numPr>
+      </w:pPr>
+      <w:r>
+        <w:t xml:space="preserve">Los Resultados de Aprendizaje conservan la explicación de cada resultado.</w:t>
+      </w:r>
+    </w:p>
+    <w:p>
+      <w:pPr>
+        <w:pStyle w:val="Heading3"/>
+      </w:pPr>
+      <w:r>
+        <w:rPr>
+          <w:b/>
+          <w:bCs/>
+        </w:rPr>
+        <w:t xml:space="preserve">Superadmin</w:t>
+      </w:r>
+    </w:p>
+    <w:p>
+      <w:pPr>
+        <w:pStyle w:val="ListParagraph"/>
+        <w:numPr>
+          <w:ilvl w:val="0"/>
+          <w:numId w:val="2"/>
+        </w:numPr>
+      </w:pPr>
+      <w:r>
+        <w:t xml:space="preserve">El botón 'Vista estudiante' abre un selector emergente (buscar por nombre o ID) y muestra el portal del estudiante elegido; reemplaza al menú 'Ver como...' del topbar.</w:t>
+      </w:r>
+    </w:p>
+    <w:p>
+      <w:pPr>
+        <w:pStyle w:val="Heading3"/>
+      </w:pPr>
+      <w:r>
+        <w:rPr>
+          <w:b/>
+          <w:bCs/>
+        </w:rPr>
+        <w:t xml:space="preserve">Convenciones y notas</w:t>
+      </w:r>
+    </w:p>
+    <w:p>
+      <w:pPr>
+        <w:pStyle w:val="ListParagraph"/>
+        <w:numPr>
+          <w:ilvl w:val="0"/>
+          <w:numId w:val="2"/>
+        </w:numPr>
+      </w:pPr>
+      <w:r>
+        <w:t xml:space="preserve">Mensajes de commit y títulos de PR en imperativo ('ajusta...', 'agrega...'), con prefijo tipo conventional commits.</w:t>
+      </w:r>
+    </w:p>
+    <w:p>
+      <w:pPr>
+        <w:pStyle w:val="ListParagraph"/>
+        <w:numPr>
+          <w:ilvl w:val="0"/>
+          <w:numId w:val="2"/>
+        </w:numPr>
+      </w:pPr>
+      <w:r>
+        <w:t xml:space="preserve">Dev local: venv + certificado autofirmado en gemelo-digital-backend/certs/ + .env local; el BRIGHTSPACE_SCOPE del .env viejo pedía grades:grades:read (ya no autorizado) y se comentó para usar el default del código.</w:t>
+      </w:r>
+    </w:p>
+    <w:p>
+      <w:r>
+        <w:br w:type="page"/>
+      </w:r>
+    </w:p>
+    <w:p>
+      <w:pPr>
+        <w:pStyle w:val="Heading1"/>
+      </w:pPr>
+      <w:r>
+        <w:rPr>
+          <w:b/>
+          <w:bCs/>
+        </w:rPr>
+        <w:t xml:space="preserve">16. Pendientes y siguientes pasos sugeridos</w:t>
+      </w:r>
+    </w:p>
+    <w:p>
+      <w:pPr>
+        <w:spacing w:after="120"/>
+      </w:pPr>
+      <w:r>
+        <w:t xml:space="preserve">Lo que queda por hacer cuando se retome el proyecto.</w:t>
+      </w:r>
+    </w:p>
+    <w:p>
+      <w:pPr>
+        <w:pStyle w:val="Heading2"/>
+      </w:pPr>
+      <w:r>
+        <w:rPr>
+          <w:b/>
+          <w:bCs/>
+        </w:rPr>
         <w:t xml:space="preserve">16.1 Pendientes de corto plazo</w:t>
+      </w:r>
+    </w:p>
+    <w:p>
+      <w:pPr>
+        <w:pStyle w:val="ListParagraph"/>
+        <w:numPr>
+          <w:ilvl w:val="0"/>
+          <w:numId w:val="2"/>
+        </w:numPr>
+      </w:pPr>
+      <w:r>
+        <w:t xml:space="preserve">Verificar en producción que 'Contenidos consumidos por estudiantes' muestre datos; si aparece 'no disponible', ajustar la ruta del user progress en el endpoint /brightspace/course/{ou}/content/consumption.</w:t>
+      </w:r>
+    </w:p>
+    <w:p>
+      <w:pPr>
+        <w:pStyle w:val="ListParagraph"/>
+        <w:numPr>
+          <w:ilvl w:val="0"/>
+          <w:numId w:val="2"/>
+        </w:numPr>
+      </w:pPr>
+      <w:r>
+        <w:t xml:space="preserve">Convertir el tip de 'nuevas funciones' del dashboard en un sistema de notificaciones (idea de la sesión de julio 2026).</w:t>
       </w:r>
     </w:p>
     <w:p>
@@ -28894,7 +29154,7 @@
           <w:sz w:val="18"/>
           <w:szCs w:val="18"/>
         </w:rPr>
-        <w:t xml:space="preserve">Última actualización: junio 2026</w:t>
+        <w:t xml:space="preserve">Última actualización: 31 de julio de 2026</w:t>
       </w:r>
     </w:p>
     <w:sectPr>

</xml_diff>

<commit_message>
feat(dashboard): renombra a "elementos" y clasifica por tipo con la Url real del archivo
- Agrega endpoint /brightspace/course/{ou}/content/topics: recorre la
  estructura de cada modulo (BFS, incluye anidados) y devuelve los
  elementos con Url, TopicType y ActivityType — el content/root solo
  trae shells sin Url y por eso todo caia en "Otro".
- Clasifica el tipo por prioridad: Url del archivo -> TopicType 3
  (enlace) -> titulo. El desglose del KPI y los iconos del detalle de
  consumo usan los metadatos reales.
- Renombra la terminologia en la UI para distinguir de los modulos de
  contenido: "Elementos publicados" (KPI), "Tipos de elemento",
  "Elementos consumidos", "N elementos" en el detalle.
- Actualiza la documentacion (md + generador docx + Word regenerado).

Co-Authored-By: Claude Fable 5 <noreply@anthropic.com>
</commit_message>
<xml_diff>
--- a/docs/Gemelo-Digital-Documentacion-Completa.docx
+++ b/docs/Gemelo-Digital-Documentacion-Completa.docx
@@ -21726,6 +21726,18 @@
       </w:pPr>
       <w:r>
         <w:t xml:space="preserve">KPI 'Contenidos publicados' con desglose por tipo desplegable (PDF, Word, Excel, PowerPoint, video, enlace, HTML, otro).</w:t>
+      </w:r>
+    </w:p>
+    <w:p>
+      <w:pPr>
+        <w:pStyle w:val="ListParagraph"/>
+        <w:numPr>
+          <w:ilvl w:val="0"/>
+          <w:numId w:val="2"/>
+        </w:numPr>
+      </w:pPr>
+      <w:r>
+        <w:t xml:space="preserve">Terminología: los archivos/páginas dentro de los módulos de contenido se llaman 'elementos' en la UI (KPI 'Elementos publicados', 'Elementos consumidos', 'Tipos de elemento'). La clasificación por tipo (PDF, Word, Excel...) usa la Url real del archivo vía el endpoint nuevo /brightspace/course/{ou}/content/topics.</w:t>
       </w:r>
     </w:p>
     <w:p>

</xml_diff>

<commit_message>
feat(dashboard): unifica total y desglose de elementos, agrupa tipos y limpia accesos del profesor
- Deriva el total del KPI "Elementos publicados" y su desglose de la
  misma fuente (/content/topics) para que los tipos siempre sumen el
  total mostrado.
- Agrupa los tipos en las categorias acordadas: HTML, PDF, Excel, Word,
  Imagenes (png/jpg/gif/svg/webp...), Audios (mp3/wav/ogg...), Videos
  (mp4/mov/webm...), Enlace (externos o internos) y Otros.
- Oculta cuentas institucionales/de servicio en "Accesos del profesor"
  (CESA Laboratorio, Desarrollo profesoral, soporte, etc.) y muestra
  solo el nombre del profesor, sin el rol.
- Actualiza la documentacion (md + generador docx + Word regenerado),
  incluida la limitacion de duracion de sesiones (solo Data Hub).

Co-Authored-By: Claude Fable 5 <noreply@anthropic.com>
</commit_message>
<xml_diff>
--- a/docs/Gemelo-Digital-Documentacion-Completa.docx
+++ b/docs/Gemelo-Digital-Documentacion-Completa.docx
@@ -21749,7 +21749,31 @@
         </w:numPr>
       </w:pPr>
       <w:r>
-        <w:t xml:space="preserve">Limitación documentada: la duración de las sesiones (tiempo conectado) no está disponible vía API REST de Brightspace; solo existe en Data Hub. Se muestra recencia de acceso, no duración.</w:t>
+        <w:t xml:space="preserve">Categorías de tipo de elemento: HTML (páginas de Brightspace), PDF, Excel, Word, Imágenes, Audios, Videos, Enlace y Otros. El total del KPI y el desglose salen de la misma fuente (/content/topics) para que siempre sumen igual.</w:t>
+      </w:r>
+    </w:p>
+    <w:p>
+      <w:pPr>
+        <w:pStyle w:val="ListParagraph"/>
+        <w:numPr>
+          <w:ilvl w:val="0"/>
+          <w:numId w:val="2"/>
+        </w:numPr>
+      </w:pPr>
+      <w:r>
+        <w:t xml:space="preserve">'Accesos del profesor' oculta cuentas institucionales/de servicio (p. ej. 'CESA Laboratorio', 'Desarrollo profesoral') y muestra solo el nombre del profesor, sin el rol.</w:t>
+      </w:r>
+    </w:p>
+    <w:p>
+      <w:pPr>
+        <w:pStyle w:val="ListParagraph"/>
+        <w:numPr>
+          <w:ilvl w:val="0"/>
+          <w:numId w:val="2"/>
+        </w:numPr>
+      </w:pPr>
+      <w:r>
+        <w:t xml:space="preserve">Limitación documentada: la duración de las sesiones (tiempo conectado) no está disponible vía API REST de Brightspace; solo existe en Data Hub. Se muestra recencia del último acceso, no duración. Para tener duración habría que habilitar Data Hub con el admin de Brightspace e ingerir los datasets vía el scheduler.</w:t>
       </w:r>
     </w:p>
     <w:p>

</xml_diff>

<commit_message>
feat(ui): redirige superadmin a su consola, agrupa el topbar en menú y muestra total de asignaciones
- Corrige el bug de refresh: si un superadmin entra a /dashboard sin
  curso seleccionado, redirige siempre a su consola (RoleHome) en vez
  de mostrar el selector de cursos de profesor.
- Agrupa Comandos, Inicio, Mis cursos, Panel de coordinación, idioma,
  tema e imprimir en un menú desplegable (icono de 9 puntos) a la
  izquierda del usuario; mantiene el buscador y el toggle Vista
  profesor/estudiante; elimina el menú muerto "Ver como..." del topbar.
- Agrega el total de asignaciones (activas + no publicadas) en la parte
  superior de la tarjeta de asignaciones, con el desglose debajo.
- Agrega claves i18n es/en para las opciones del menú.
- Actualiza la documentacion (md + generador docx + Word regenerado).

Co-Authored-By: Claude Fable 5 <noreply@anthropic.com>
</commit_message>
<xml_diff>
--- a/docs/Gemelo-Digital-Documentacion-Completa.docx
+++ b/docs/Gemelo-Digital-Documentacion-Completa.docx
@@ -21762,6 +21762,42 @@
       </w:pPr>
       <w:r>
         <w:t xml:space="preserve">'Accesos del profesor' oculta cuentas institucionales/de servicio (p. ej. 'CESA Laboratorio', 'Desarrollo profesoral') y muestra solo el nombre del profesor, sin el rol.</w:t>
+      </w:r>
+    </w:p>
+    <w:p>
+      <w:pPr>
+        <w:pStyle w:val="ListParagraph"/>
+        <w:numPr>
+          <w:ilvl w:val="0"/>
+          <w:numId w:val="2"/>
+        </w:numPr>
+      </w:pPr>
+      <w:r>
+        <w:t xml:space="preserve">Fix superadmin: al refrescar en /dashboard sin curso seleccionado, el usuario superadmin ya no cae en el selector de cursos de profesor — se redirige siempre a su consola (RoleHome).</w:t>
+      </w:r>
+    </w:p>
+    <w:p>
+      <w:pPr>
+        <w:pStyle w:val="ListParagraph"/>
+        <w:numPr>
+          <w:ilvl w:val="0"/>
+          <w:numId w:val="2"/>
+        </w:numPr>
+      </w:pPr>
+      <w:r>
+        <w:t xml:space="preserve">Topbar reorganizado: buscador y toggle Vista profesor/estudiante se mantienen; Comandos, Inicio, Mis cursos, Panel de coordinación, idioma, tema e imprimir van en un menú desplegable (icono de 9 puntos) a la izquierda del usuario.</w:t>
+      </w:r>
+    </w:p>
+    <w:p>
+      <w:pPr>
+        <w:pStyle w:val="ListParagraph"/>
+        <w:numPr>
+          <w:ilvl w:val="0"/>
+          <w:numId w:val="2"/>
+        </w:numPr>
+      </w:pPr>
+      <w:r>
+        <w:t xml:space="preserve">Asignaciones: la tarjeta muestra arriba el total de asignaciones (activas + no publicadas) y debajo el desglose.</w:t>
       </w:r>
     </w:p>
     <w:p>

</xml_diff>

<commit_message>
docs: detalla el procedimiento de publicacion paso a paso (push del desarrollador, merge manual del dueño)
- Agrega en la seccion 4 del md el flujo detallado de publicacion:
  tabla resumen de remotes (produccion / origin respaldo / colaborador
  bloqueado), comandos exactos de rama, verificacion, push a ambos
  repos y apertura del PR, y el limite explicito del desarrollador
  (nunca mergear, nunca push a main, nunca tocar el repo de Juan).
- Documenta la parte del dueño: revision en Files changed, merge manual
  del PR como unico evento que despliega, verificacion en Actions y en
  produccion en incognito.
- Actualiza el recetario "Hacer un cambio de codigo y desplegarlo" para
  que apunte al flujo detallado con los comandos reales.
- Replica el paso a paso y la tabla de remotes en el generador del Word
  y regenera Gemelo-Digital-Documentacion-Completa.docx.

Co-Authored-By: Claude Fable 5 <noreply@anthropic.com>
</commit_message>
<xml_diff>
--- a/docs/Gemelo-Digital-Documentacion-Completa.docx
+++ b/docs/Gemelo-Digital-Documentacion-Completa.docx
@@ -6265,6 +6265,397 @@
       </w:pPr>
       <w:r>
         <w:t xml:space="preserve">Solo el merge a main del repo principal dispara el deploy automático a producción. Nada de lo que pase en origin (respaldo) o en local despliega nada.</w:t>
+      </w:r>
+    </w:p>
+    <w:p>
+      <w:pPr>
+        <w:pStyle w:val="Heading3"/>
+      </w:pPr>
+      <w:r>
+        <w:rPr>
+          <w:b/>
+          <w:bCs/>
+        </w:rPr>
+        <w:t xml:space="preserve">Resumen de remotes en la carpeta local</w:t>
+      </w:r>
+    </w:p>
+    <w:tbl>
+      <w:tblPr>
+        <w:tblW w:type="dxa" w:w="9360"/>
+        <w:tblBorders>
+          <w:top w:val="single" w:color="auto" w:sz="4"/>
+          <w:left w:val="single" w:color="auto" w:sz="4"/>
+          <w:bottom w:val="single" w:color="auto" w:sz="4"/>
+          <w:right w:val="single" w:color="auto" w:sz="4"/>
+          <w:insideH w:val="single" w:color="auto" w:sz="4"/>
+          <w:insideV w:val="single" w:color="auto" w:sz="4"/>
+        </w:tblBorders>
+      </w:tblPr>
+      <w:tblGrid>
+        <w:gridCol w:w="3000"/>
+        <w:gridCol w:w="6360"/>
+      </w:tblGrid>
+      <w:tr>
+        <w:tc>
+          <w:tcPr>
+            <w:tcW w:type="auto" w:w="0"/>
+            <w:tcBorders>
+              <w:top w:val="single" w:color="999999" w:sz="4"/>
+              <w:left w:val="single" w:color="999999" w:sz="4"/>
+              <w:bottom w:val="single" w:color="999999" w:sz="4"/>
+              <w:right w:val="single" w:color="999999" w:sz="4"/>
+            </w:tcBorders>
+            <w:shd w:fill="D5E8F0" w:val="clear"/>
+            <w:tcMar>
+              <w:top w:type="dxa" w:w="80"/>
+              <w:left w:type="dxa" w:w="120"/>
+              <w:bottom w:type="dxa" w:w="80"/>
+              <w:right w:type="dxa" w:w="120"/>
+            </w:tcMar>
+          </w:tcPr>
+          <w:p>
+            <w:r>
+              <w:rPr>
+                <w:b/>
+                <w:bCs/>
+              </w:rPr>
+              <w:t xml:space="preserve">Remote</w:t>
+            </w:r>
+          </w:p>
+        </w:tc>
+        <w:tc>
+          <w:tcPr>
+            <w:tcW w:type="auto" w:w="0"/>
+            <w:tcBorders>
+              <w:top w:val="single" w:color="999999" w:sz="4"/>
+              <w:left w:val="single" w:color="999999" w:sz="4"/>
+              <w:bottom w:val="single" w:color="999999" w:sz="4"/>
+              <w:right w:val="single" w:color="999999" w:sz="4"/>
+            </w:tcBorders>
+            <w:shd w:fill="D5E8F0" w:val="clear"/>
+            <w:tcMar>
+              <w:top w:type="dxa" w:w="80"/>
+              <w:left w:type="dxa" w:w="120"/>
+              <w:bottom w:type="dxa" w:w="80"/>
+              <w:right w:type="dxa" w:w="120"/>
+            </w:tcMar>
+          </w:tcPr>
+          <w:p>
+            <w:r>
+              <w:rPr>
+                <w:b/>
+                <w:bCs/>
+              </w:rPr>
+              <w:t xml:space="preserve">Repositorio y regla</w:t>
+            </w:r>
+          </w:p>
+        </w:tc>
+      </w:tr>
+      <w:tr>
+        <w:tc>
+          <w:tcPr>
+            <w:tcW w:type="dxa" w:w="3000"/>
+            <w:tcBorders>
+              <w:top w:val="single" w:color="999999" w:sz="4"/>
+              <w:left w:val="single" w:color="999999" w:sz="4"/>
+              <w:bottom w:val="single" w:color="999999" w:sz="4"/>
+              <w:right w:val="single" w:color="999999" w:sz="4"/>
+            </w:tcBorders>
+            <w:tcMar>
+              <w:top w:type="dxa" w:w="80"/>
+              <w:left w:type="dxa" w:w="120"/>
+              <w:bottom w:type="dxa" w:w="80"/>
+              <w:right w:type="dxa" w:w="120"/>
+            </w:tcMar>
+          </w:tcPr>
+          <w:p>
+            <w:r>
+              <w:rPr>
+                <w:b/>
+                <w:bCs/>
+              </w:rPr>
+              <w:t xml:space="preserve">produccion</w:t>
+            </w:r>
+          </w:p>
+        </w:tc>
+        <w:tc>
+          <w:tcPr>
+            <w:tcW w:type="dxa" w:w="6360"/>
+            <w:tcBorders>
+              <w:top w:val="single" w:color="999999" w:sz="4"/>
+              <w:left w:val="single" w:color="999999" w:sz="4"/>
+              <w:bottom w:val="single" w:color="999999" w:sz="4"/>
+              <w:right w:val="single" w:color="999999" w:sz="4"/>
+            </w:tcBorders>
+            <w:tcMar>
+              <w:top w:type="dxa" w:w="80"/>
+              <w:left w:type="dxa" w:w="120"/>
+              <w:bottom w:type="dxa" w:w="80"/>
+              <w:right w:type="dxa" w:w="120"/>
+            </w:tcMar>
+          </w:tcPr>
+          <w:p>
+            <w:r>
+              <w:t xml:space="preserve">JCortes87/proyecto-gemelos-digitales-JC — push permitido SOLO de ramas (nunca main). Aquí se abren los PR; el merge a main despliega.</w:t>
+            </w:r>
+          </w:p>
+        </w:tc>
+      </w:tr>
+      <w:tr>
+        <w:tc>
+          <w:tcPr>
+            <w:tcW w:type="dxa" w:w="3000"/>
+            <w:tcBorders>
+              <w:top w:val="single" w:color="999999" w:sz="4"/>
+              <w:left w:val="single" w:color="999999" w:sz="4"/>
+              <w:bottom w:val="single" w:color="999999" w:sz="4"/>
+              <w:right w:val="single" w:color="999999" w:sz="4"/>
+            </w:tcBorders>
+            <w:tcMar>
+              <w:top w:type="dxa" w:w="80"/>
+              <w:left w:type="dxa" w:w="120"/>
+              <w:bottom w:type="dxa" w:w="80"/>
+              <w:right w:type="dxa" w:w="120"/>
+            </w:tcMar>
+          </w:tcPr>
+          <w:p>
+            <w:r>
+              <w:rPr>
+                <w:b/>
+                <w:bCs/>
+              </w:rPr>
+              <w:t xml:space="preserve">origin</w:t>
+            </w:r>
+          </w:p>
+        </w:tc>
+        <w:tc>
+          <w:tcPr>
+            <w:tcW w:type="dxa" w:w="6360"/>
+            <w:tcBorders>
+              <w:top w:val="single" w:color="999999" w:sz="4"/>
+              <w:left w:val="single" w:color="999999" w:sz="4"/>
+              <w:bottom w:val="single" w:color="999999" w:sz="4"/>
+              <w:right w:val="single" w:color="999999" w:sz="4"/>
+            </w:tcBorders>
+            <w:tcMar>
+              <w:top w:type="dxa" w:w="80"/>
+              <w:left w:type="dxa" w:w="120"/>
+              <w:bottom w:type="dxa" w:w="80"/>
+              <w:right w:type="dxa" w:w="120"/>
+            </w:tcMar>
+          </w:tcPr>
+          <w:p>
+            <w:r>
+              <w:t xml:space="preserve">JCortes87/gemelo-digital-v2.0 — solo respaldo, sin CI/CD. Pushear aquí no despliega nada.</w:t>
+            </w:r>
+          </w:p>
+        </w:tc>
+      </w:tr>
+      <w:tr>
+        <w:tc>
+          <w:tcPr>
+            <w:tcW w:type="dxa" w:w="3000"/>
+            <w:tcBorders>
+              <w:top w:val="single" w:color="999999" w:sz="4"/>
+              <w:left w:val="single" w:color="999999" w:sz="4"/>
+              <w:bottom w:val="single" w:color="999999" w:sz="4"/>
+              <w:right w:val="single" w:color="999999" w:sz="4"/>
+            </w:tcBorders>
+            <w:tcMar>
+              <w:top w:type="dxa" w:w="80"/>
+              <w:left w:type="dxa" w:w="120"/>
+              <w:bottom w:type="dxa" w:w="80"/>
+              <w:right w:type="dxa" w:w="120"/>
+            </w:tcMar>
+          </w:tcPr>
+          <w:p>
+            <w:r>
+              <w:rPr>
+                <w:b/>
+                <w:bCs/>
+              </w:rPr>
+              <w:t xml:space="preserve">colaborador</w:t>
+            </w:r>
+          </w:p>
+        </w:tc>
+        <w:tc>
+          <w:tcPr>
+            <w:tcW w:type="dxa" w:w="6360"/>
+            <w:tcBorders>
+              <w:top w:val="single" w:color="999999" w:sz="4"/>
+              <w:left w:val="single" w:color="999999" w:sz="4"/>
+              <w:bottom w:val="single" w:color="999999" w:sz="4"/>
+              <w:right w:val="single" w:color="999999" w:sz="4"/>
+            </w:tcBorders>
+            <w:tcMar>
+              <w:top w:type="dxa" w:w="80"/>
+              <w:left w:type="dxa" w:w="120"/>
+              <w:bottom w:type="dxa" w:w="80"/>
+              <w:right w:type="dxa" w:w="120"/>
+            </w:tcMar>
+          </w:tcPr>
+          <w:p>
+            <w:r>
+              <w:t xml:space="preserve">juandavid639/Proyecto-Gemelos-Digitales — push BLOQUEADO (DISABLED-no-push-to-upstream). Solo git fetch de referencia. NO SE TOCA.</w:t>
+            </w:r>
+          </w:p>
+        </w:tc>
+      </w:tr>
+    </w:tbl>
+    <w:p>
+      <w:pPr>
+        <w:pStyle w:val="Heading3"/>
+      </w:pPr>
+      <w:r>
+        <w:rPr>
+          <w:b/>
+          <w:bCs/>
+        </w:rPr>
+        <w:t xml:space="preserve">Procedimiento paso a paso — Parte 1: quien desarrolla</w:t>
+      </w:r>
+    </w:p>
+    <w:p>
+      <w:pPr>
+        <w:pStyle w:val="ListParagraph"/>
+        <w:numPr>
+          <w:ilvl w:val="0"/>
+          <w:numId w:val="2"/>
+        </w:numPr>
+      </w:pPr>
+      <w:r>
+        <w:t xml:space="preserve">1. Crear rama nueva con prefijo conventional commits: git checkout -b feat/nombre-descriptivo (o fix/, style/, docs/).</w:t>
+      </w:r>
+    </w:p>
+    <w:p>
+      <w:pPr>
+        <w:pStyle w:val="ListParagraph"/>
+        <w:numPr>
+          <w:ilvl w:val="0"/>
+          <w:numId w:val="2"/>
+        </w:numPr>
+      </w:pPr>
+      <w:r>
+        <w:t xml:space="preserve">2. Hacer los cambios y VERIFICAR antes de commitear: npm test, npm run build y lint sin errores nuevos.</w:t>
+      </w:r>
+    </w:p>
+    <w:p>
+      <w:pPr>
+        <w:pStyle w:val="ListParagraph"/>
+        <w:numPr>
+          <w:ilvl w:val="0"/>
+          <w:numId w:val="2"/>
+        </w:numPr>
+      </w:pPr>
+      <w:r>
+        <w:t xml:space="preserve">3. git commit con mensaje en imperativo y prefijo (ej. feat(dashboard): agrega tarjeta de accesos).</w:t>
+      </w:r>
+    </w:p>
+    <w:p>
+      <w:pPr>
+        <w:pStyle w:val="ListParagraph"/>
+        <w:numPr>
+          <w:ilvl w:val="0"/>
+          <w:numId w:val="2"/>
+        </w:numPr>
+      </w:pPr>
+      <w:r>
+        <w:t xml:space="preserve">4. Pushear la MISMA rama a los dos repos del dueño: git push produccion &lt;rama&gt; y git push origin &lt;rama&gt;. Pushear la rama a produccion NO despliega — los workflows solo se disparan con cambios en main.</w:t>
+      </w:r>
+    </w:p>
+    <w:p>
+      <w:pPr>
+        <w:pStyle w:val="ListParagraph"/>
+        <w:numPr>
+          <w:ilvl w:val="0"/>
+          <w:numId w:val="2"/>
+        </w:numPr>
+      </w:pPr>
+      <w:r>
+        <w:t xml:space="preserve">5. Abrir el Pull Request hacia main del repo principal con el enlace que imprime GitHub: https://github.com/JCortes87/proyecto-gemelos-digitales-JC/pull/new/&lt;rama&gt;.</w:t>
+      </w:r>
+    </w:p>
+    <w:p>
+      <w:pPr>
+        <w:pStyle w:val="ListParagraph"/>
+        <w:numPr>
+          <w:ilvl w:val="0"/>
+          <w:numId w:val="2"/>
+        </w:numPr>
+      </w:pPr>
+      <w:r>
+        <w:t xml:space="preserve">6. FIN del trabajo del desarrollador. Prohibido: mergear el PR, push directo a main, y cualquier escritura sobre colaborador (repo de Juan).</w:t>
+      </w:r>
+    </w:p>
+    <w:p>
+      <w:pPr>
+        <w:pStyle w:val="Heading3"/>
+      </w:pPr>
+      <w:r>
+        <w:rPr>
+          <w:b/>
+          <w:bCs/>
+        </w:rPr>
+        <w:t xml:space="preserve">Procedimiento paso a paso — Parte 2: el dueño (merge manual)</w:t>
+      </w:r>
+    </w:p>
+    <w:p>
+      <w:pPr>
+        <w:pStyle w:val="ListParagraph"/>
+        <w:numPr>
+          <w:ilvl w:val="0"/>
+          <w:numId w:val="2"/>
+        </w:numPr>
+      </w:pPr>
+      <w:r>
+        <w:t xml:space="preserve">1. Abrir el PR en GitHub → pestaña Files changed → revisar el diff.</w:t>
+      </w:r>
+    </w:p>
+    <w:p>
+      <w:pPr>
+        <w:pStyle w:val="ListParagraph"/>
+        <w:numPr>
+          <w:ilvl w:val="0"/>
+          <w:numId w:val="2"/>
+        </w:numPr>
+      </w:pPr>
+      <w:r>
+        <w:t xml:space="preserve">2. Botón verde 'Merge pull request' → 'Confirm merge'. Este clic es el ÚNICO evento que despliega a producción.</w:t>
+      </w:r>
+    </w:p>
+    <w:p>
+      <w:pPr>
+        <w:pStyle w:val="ListParagraph"/>
+        <w:numPr>
+          <w:ilvl w:val="0"/>
+          <w:numId w:val="2"/>
+        </w:numPr>
+      </w:pPr>
+      <w:r>
+        <w:t xml:space="preserve">3. Verificar en la pestaña Actions que los workflows queden en verde (frontend ~3 min; backend ~10 min; docs/** no dispara ninguno).</w:t>
+      </w:r>
+    </w:p>
+    <w:p>
+      <w:pPr>
+        <w:pStyle w:val="ListParagraph"/>
+        <w:numPr>
+          <w:ilvl w:val="0"/>
+          <w:numId w:val="2"/>
+        </w:numPr>
+      </w:pPr>
+      <w:r>
+        <w:t xml:space="preserve">4. Comprobar en https://gemelo.cesa.edu.co en ventana de incógnito (o Ctrl+Shift+R).</w:t>
+      </w:r>
+    </w:p>
+    <w:p>
+      <w:pPr>
+        <w:pStyle w:val="ListParagraph"/>
+        <w:numPr>
+          <w:ilvl w:val="0"/>
+          <w:numId w:val="2"/>
+        </w:numPr>
+      </w:pPr>
+      <w:r>
+        <w:t xml:space="preserve">5. Si un workflow falla, producción NO se ve afectada (siguen sirviendo el contenedor y archivos anteriores); ver sección de rollback.</w:t>
       </w:r>
     </w:p>
     <w:p>

</xml_diff>

<commit_message>
docs: documenta la convencion de redaccion de commits y pull requests
- Agrega al flujo de publicacion la convencion fija de redaccion:
  español, modo imperativo ("agrega", "ajusta", "corrige"), prefijo
  tipo conventional commits con ambito (feat/fix/style/docs/chore/
  perf/sec), titulo del PR igual al del commit principal y descripcion
  en viñetas imperativas sin narrativa personal.
- Incluye ejemplos correctos e incorrectos para que la convencion se
  mantenga con cualquier persona o asistente que desarrolle.
- Replica la seccion en el generador del Word y regenera el .docx.

Co-Authored-By: Claude Fable 5 <noreply@anthropic.com>
</commit_message>
<xml_diff>
--- a/docs/Gemelo-Digital-Documentacion-Completa.docx
+++ b/docs/Gemelo-Digital-Documentacion-Completa.docx
@@ -6656,6 +6656,194 @@
       </w:pPr>
       <w:r>
         <w:t xml:space="preserve">5. Si un workflow falla, producción NO se ve afectada (siguen sirviendo el contenedor y archivos anteriores); ver sección de rollback.</w:t>
+      </w:r>
+    </w:p>
+    <w:p>
+      <w:pPr>
+        <w:pStyle w:val="Heading3"/>
+      </w:pPr>
+      <w:r>
+        <w:rPr>
+          <w:b/>
+          <w:bCs/>
+        </w:rPr>
+        <w:t xml:space="preserve">Redacción de commits y Pull Requests (convención fija)</w:t>
+      </w:r>
+    </w:p>
+    <w:p>
+      <w:pPr>
+        <w:spacing w:after="120"/>
+      </w:pPr>
+      <w:r>
+        <w:t xml:space="preserve">Los mensajes de commit y los textos de los PR siguen SIEMPRE el mismo formato. Aplica a cualquier persona o asistente que desarrolle:</w:t>
+      </w:r>
+    </w:p>
+    <w:p>
+      <w:pPr>
+        <w:pStyle w:val="ListParagraph"/>
+        <w:numPr>
+          <w:ilvl w:val="0"/>
+          <w:numId w:val="2"/>
+        </w:numPr>
+      </w:pPr>
+      <w:r>
+        <w:t xml:space="preserve">Idioma: español.</w:t>
+      </w:r>
+    </w:p>
+    <w:p>
+      <w:pPr>
+        <w:pStyle w:val="ListParagraph"/>
+        <w:numPr>
+          <w:ilvl w:val="0"/>
+          <w:numId w:val="2"/>
+        </w:numPr>
+      </w:pPr>
+      <w:r>
+        <w:t xml:space="preserve">Modo imperativo: verbos que describen lo que hace el cambio al aplicarse — 'agrega', 'ajusta', 'corrige', 'mueve', 'elimina', 'renombra'. Nunca en pasado ('se agregó') ni en tono conversacional ('te dejé listo…').</w:t>
+      </w:r>
+    </w:p>
+    <w:p>
+      <w:pPr>
+        <w:pStyle w:val="ListParagraph"/>
+        <w:numPr>
+          <w:ilvl w:val="0"/>
+          <w:numId w:val="2"/>
+        </w:numPr>
+      </w:pPr>
+      <w:r>
+        <w:t xml:space="preserve">Prefijo tipo conventional commits con ámbito entre paréntesis: feat(dashboard):, fix(auth):, style(portal):, docs:, chore:, perf:, sec:.</w:t>
+      </w:r>
+    </w:p>
+    <w:p>
+      <w:pPr>
+        <w:pStyle w:val="ListParagraph"/>
+        <w:numPr>
+          <w:ilvl w:val="0"/>
+          <w:numId w:val="2"/>
+        </w:numPr>
+      </w:pPr>
+      <w:r>
+        <w:t xml:space="preserve">Título del PR = título del commit principal: una sola línea, prefijo + resumen en imperativo. No inventar un título distinto.</w:t>
+      </w:r>
+    </w:p>
+    <w:p>
+      <w:pPr>
+        <w:pStyle w:val="ListParagraph"/>
+        <w:numPr>
+          <w:ilvl w:val="0"/>
+          <w:numId w:val="2"/>
+        </w:numPr>
+      </w:pPr>
+      <w:r>
+        <w:t xml:space="preserve">Descripción del PR / cuerpo del commit: lista de viñetas, cada una en imperativo, diciendo qué cambia y — cuando no sea obvio — por qué. Sin narrativa personal ni saludos.</w:t>
+      </w:r>
+    </w:p>
+    <w:p>
+      <w:pPr>
+        <w:spacing w:after="120"/>
+      </w:pPr>
+      <w:r>
+        <w:rPr>
+          <w:b/>
+          <w:bCs/>
+        </w:rPr>
+        <w:t xml:space="preserve">Ejemplos correctos:</w:t>
+      </w:r>
+    </w:p>
+    <w:p>
+      <w:pPr>
+        <w:shd w:fill="F4F4F4" w:val="clear"/>
+        <w:spacing w:after="120"/>
+      </w:pPr>
+      <w:r>
+        <w:rPr>
+          <w:rFonts w:ascii="Consolas" w:cs="Consolas" w:eastAsia="Consolas" w:hAnsi="Consolas"/>
+          <w:sz w:val="18"/>
+          <w:szCs w:val="18"/>
+        </w:rPr>
+        <w:t xml:space="preserve">feat(dashboard): agrega tarjeta de accesos al curso con recencia por estudiante</w:t>
+      </w:r>
+    </w:p>
+    <w:p>
+      <w:pPr>
+        <w:shd w:fill="F4F4F4" w:val="clear"/>
+        <w:spacing w:after="120"/>
+      </w:pPr>
+      <w:r>
+        <w:rPr>
+          <w:rFonts w:ascii="Consolas" w:cs="Consolas" w:eastAsia="Consolas" w:hAnsi="Consolas"/>
+          <w:sz w:val="18"/>
+          <w:szCs w:val="18"/>
+        </w:rPr>
+        <w:t xml:space="preserve">fix(ui): corrige la pestaña inicial del dashboard (abría en Estudiantes)</w:t>
+      </w:r>
+    </w:p>
+    <w:p>
+      <w:pPr>
+        <w:shd w:fill="F4F4F4" w:val="clear"/>
+        <w:spacing w:after="120"/>
+      </w:pPr>
+      <w:r>
+        <w:rPr>
+          <w:rFonts w:ascii="Consolas" w:cs="Consolas" w:eastAsia="Consolas" w:hAnsi="Consolas"/>
+          <w:sz w:val="18"/>
+          <w:szCs w:val="18"/>
+        </w:rPr>
+        <w:t xml:space="preserve">docs: detalla el procedimiento de publicacion paso a paso</w:t>
+      </w:r>
+    </w:p>
+    <w:p>
+      <w:pPr>
+        <w:spacing w:after="120"/>
+      </w:pPr>
+      <w:r>
+        <w:rPr>
+          <w:b/>
+          <w:bCs/>
+        </w:rPr>
+        <w:t xml:space="preserve">Ejemplos incorrectos:</w:t>
+      </w:r>
+    </w:p>
+    <w:p>
+      <w:pPr>
+        <w:shd w:fill="F4F4F4" w:val="clear"/>
+        <w:spacing w:after="120"/>
+      </w:pPr>
+      <w:r>
+        <w:rPr>
+          <w:rFonts w:ascii="Consolas" w:cs="Consolas" w:eastAsia="Consolas" w:hAnsi="Consolas"/>
+          <w:sz w:val="18"/>
+          <w:szCs w:val="18"/>
+        </w:rPr>
+        <w:t xml:space="preserve">Cambios varios                      &lt;- no dice qué hace</w:t>
+      </w:r>
+    </w:p>
+    <w:p>
+      <w:pPr>
+        <w:shd w:fill="F4F4F4" w:val="clear"/>
+        <w:spacing w:after="120"/>
+      </w:pPr>
+      <w:r>
+        <w:rPr>
+          <w:rFonts w:ascii="Consolas" w:cs="Consolas" w:eastAsia="Consolas" w:hAnsi="Consolas"/>
+          <w:sz w:val="18"/>
+          <w:szCs w:val="18"/>
+        </w:rPr>
+        <w:t xml:space="preserve">Se agregó la tarjeta de accesos     &lt;- pasado, no imperativo</w:t>
+      </w:r>
+    </w:p>
+    <w:p>
+      <w:pPr>
+        <w:shd w:fill="F4F4F4" w:val="clear"/>
+        <w:spacing w:after="120"/>
+      </w:pPr>
+      <w:r>
+        <w:rPr>
+          <w:rFonts w:ascii="Consolas" w:cs="Consolas" w:eastAsia="Consolas" w:hAnsi="Consolas"/>
+          <w:sz w:val="18"/>
+          <w:szCs w:val="18"/>
+        </w:rPr>
+        <w:t xml:space="preserve">Hola, aquí te dejo lo del dashboard &lt;- conversacional</w:t>
       </w:r>
     </w:p>
     <w:p>

</xml_diff>

<commit_message>
style(portal): muestra la nota en velocimetro y mueve las proximas entregas debajo de RA
- Reemplaza el donut de "Mi nota" por el velocimetro (GaugeMeter) con
  zonas rojo/ambar/verde segun los umbrales y la nota /10 al centro.
- Mueve la tarjeta "Mis proximas entregas" para que quede inmediatamente
  debajo de "Mis Resultados de Aprendizaje".
- Actualiza la documentacion (md + generador docx + Word regenerado) con
  el rediseño del portal, el desglose por cortes, el estado de
  asignaciones y el endpoint nuevo de entregas por estudiante.

Co-Authored-By: Claude Fable 5 <noreply@anthropic.com>
</commit_message>
<xml_diff>
--- a/docs/Gemelo-Digital-Documentacion-Completa.docx
+++ b/docs/Gemelo-Digital-Documentacion-Completa.docx
@@ -23123,6 +23123,18 @@
       </w:pPr>
       <w:r>
         <w:t xml:space="preserve">Asignaciones: la tarjeta muestra arriba el total de asignaciones (activas + no publicadas) y debajo el desglose.</w:t>
+      </w:r>
+    </w:p>
+    <w:p>
+      <w:pPr>
+        <w:pStyle w:val="ListParagraph"/>
+        <w:numPr>
+          <w:ilvl w:val="0"/>
+          <w:numId w:val="2"/>
+        </w:numPr>
+      </w:pPr>
+      <w:r>
+        <w:t xml:space="preserve">Portal del estudiante rediseñado (2-3 ago): tarjeta 'Mi nota' con velocímetro (GaugeMeter) y desglose por corte 1/2/3 + nota final calculada cuando los 3 cortes están calificados; tarjeta 'Mis asignaciones' con % entregadas y % calificadas (desplegables con la nota de cada una, cruzada con el gradebook vía gradeItemId); calendario de próximas entregas debajo de Resultados de Aprendizaje. Nuevo endpoint GET /brightspace/course/{ou}/dropbox/student/{userId}/status (entrega/calificación por asignación publicada, con soporte de entregas grupales).</w:t>
       </w:r>
     </w:p>
     <w:p>

</xml_diff>

<commit_message>
fix(dashboard): muestra el promedio de acceso a contenidos en cursos con modulos anidados
- Corrige el conteo de temas de contenido (totalContentTopics): ahora se
  toma de /content/topics, que recorre los submodulos anidados filtrando
  ocultos, con fallback al conteo del primer nivel de content/root. En
  cursos con contenidos dentro de submodulos el total daba 0, avgPct
  quedaba nulo y la barra de promedio nunca se mostraba encima del
  desplegable "Acceso a contenidos".
- Renombra la etiqueta de la barra de "Promedio de elementos abiertos" a
  "Promedio de acceso a contenidos" para que se lea como el resumen del
  desplegable que tiene debajo.
- Actualiza la documentacion (md + generador docx + Word regenerado) con
  el fix de la tarjeta "Accesos al curso".

Co-Authored-By: Claude Fable 5 <noreply@anthropic.com>
</commit_message>
<xml_diff>
--- a/docs/Gemelo-Digital-Documentacion-Completa.docx
+++ b/docs/Gemelo-Digital-Documentacion-Completa.docx
@@ -23135,6 +23135,18 @@
       </w:pPr>
       <w:r>
         <w:t xml:space="preserve">Portal del estudiante rediseñado (2-3 ago): tarjeta 'Mi nota' con anillo circular (CircularRing, el mismo gráfico de los Resultados de Aprendizaje) mostrando solo la nota general — el desglose por corte 1/2/3 se retiró porque la estructura de cortes del gradebook varía entre cursos y a muchos les saldría 'sin calificar'; tarjeta 'Mis asignaciones' con % entregadas (sobre el total) y % calificadas sobre las entregadas, para una lectura coherente de las dos barras (contador 'X/Y calificadas'); el desplegable de entregadas lista también las pendientes por entregar: en gris las ya vencidas o lejanas (con su fecha) y con texto rojo discreto las que vencen en menos de 7 días; el detalle muestra la nota de cada una, cruzada con el gradebook vía gradeItemId; calendario de próximas entregas debajo de Resultados de Aprendizaje — en la lista del calendario, las entregas que vencen en 7 días o menos llevan borde rojo (además del distintivo '!' pulsante que ya existía para las de menos de 2 días). Nuevo endpoint GET /brightspace/course/{ou}/dropbox/student/{userId}/status (entrega/calificación por asignación publicada, con soporte de entregas grupales).</w:t>
+      </w:r>
+    </w:p>
+    <w:p>
+      <w:pPr>
+        <w:pStyle w:val="ListParagraph"/>
+        <w:numPr>
+          <w:ilvl w:val="0"/>
+          <w:numId w:val="2"/>
+        </w:numPr>
+      </w:pPr>
+      <w:r>
+        <w:t xml:space="preserve">Fix en 'Accesos al curso' (3 ago): la barra 'Promedio de acceso a contenidos' (encima del desplegable 'Acceso a contenidos') no se mostraba en cursos con módulos anidados — el total de temas se contaba solo con el primer nivel de content/root y daba 0. Ahora el total se toma de /content/topics (que recorre submódulos, filtrando ocultos) con fallback al conteo del root.</w:t>
       </w:r>
     </w:p>
     <w:p>

</xml_diff>

<commit_message>
style(dashboard): mueve el consumo de contenidos a la tarjeta "Elementos publicados"
- Traslada el bloque completo de consumo de contenidos desde la tarjeta
  "Accesos al curso" a la tarjeta KPI "Elementos publicados": barras de
  "Promedio de acceso a contenidos" y "X de Y estudiantes han abierto
  elementos", mas el desplegable "Acceso a contenidos" con el detalle
  por estudiante y los elementos que abrio cada uno (sin cambios de
  comportamiento en el bloque).
- Ordena la tarjeta como total publicado, desglose por tipos y debajo el
  consumo, para que publicacion y acceso se lean juntos.
- Mueve el InfoTooltip explicativo del consumo junto a la etiqueta
  "Promedio de acceso a contenidos".
- Deja la tarjeta "Accesos al curso" solo con recencia de accesos de
  estudiantes y accesos del profesor.
- Actualiza la documentacion (md + generador docx + Word regenerado) con
  la reubicacion del bloque.

Co-Authored-By: Claude Fable 5 <noreply@anthropic.com>
</commit_message>
<xml_diff>
--- a/docs/Gemelo-Digital-Documentacion-Completa.docx
+++ b/docs/Gemelo-Digital-Documentacion-Completa.docx
@@ -23146,7 +23146,19 @@
         </w:numPr>
       </w:pPr>
       <w:r>
-        <w:t xml:space="preserve">Fix en 'Accesos al curso' (3 ago): la barra 'Promedio de acceso a contenidos' (encima del desplegable 'Acceso a contenidos') no se mostraba en cursos con módulos anidados — el total de temas se contaba solo con el primer nivel de content/root y daba 0. Ahora el total se toma de /content/topics (que recorre submódulos, filtrando ocultos) con fallback al conteo del root.</w:t>
+        <w:t xml:space="preserve">Fix en el consumo de contenidos (3 ago): la barra 'Promedio de acceso a contenidos' no se mostraba en cursos con módulos anidados — el total de temas se contaba solo con el primer nivel de content/root y daba 0. Ahora el total se toma de /content/topics (que recorre submódulos, filtrando ocultos) con fallback al conteo del root.</w:t>
+      </w:r>
+    </w:p>
+    <w:p>
+      <w:pPr>
+        <w:pStyle w:val="ListParagraph"/>
+        <w:numPr>
+          <w:ilvl w:val="0"/>
+          <w:numId w:val="2"/>
+        </w:numPr>
+      </w:pPr>
+      <w:r>
+        <w:t xml:space="preserve">Reubicación del consumo de contenidos (3 ago): el bloque completo (barras 'Promedio de acceso a contenidos' y 'X de Y estudiantes han abierto elementos' + desplegable 'Acceso a contenidos' con el detalle por estudiante) se movió de la tarjeta 'Accesos al curso' a la tarjeta KPI 'Elementos publicados', para que publicación y consumo se lean juntos: total publicado, tipos de elemento y debajo cuánto acceden los estudiantes.</w:t>
       </w:r>
     </w:p>
     <w:p>

</xml_diff>

<commit_message>
style(dashboard): completa "Ingresaron" en accesos y establece la rama unica de trabajo
- Cambia en la tarjeta "Accesos al curso" los dos labels restantes:
  "Sin entrar hace +14 dias" → "Sin ingresar hace +14 dias" y
  "Nunca han entrado" → "Nunca han ingresado".
- Documenta el nuevo flujo de rama unica: todo cambio se commitea en la
  rama reutilizable "desarrollo", se pushea a produccion y origin, y de
  ahi se abre el PR a main; tras el merge la rama NO se borra y se
  reutiliza para el siguiente cambio (secciones 4 y 10 del md maestro).
- Registra la limpieza de las ramas por-cambio ya mergeadas en ambos
  remotes.
- Actualiza la documentacion (md + generador docx + Word regenerado) con
  los labels nuevos y la convencion de rama unica.

Co-Authored-By: Claude Fable 5 <noreply@anthropic.com>
</commit_message>
<xml_diff>
--- a/docs/Gemelo-Digital-Documentacion-Completa.docx
+++ b/docs/Gemelo-Digital-Documentacion-Completa.docx
@@ -23170,7 +23170,19 @@
         </w:numPr>
       </w:pPr>
       <w:r>
-        <w:t xml:space="preserve">Renombres de forma en la vista docente (3 ago): KPI 'Nota promedio' → 'Calificación promedio' (donut más grande y centrado verticalmente); 'Elementos publicados' → 'Recursos educativos publicados' ('Tipos de recurso educativo', 'Promedio de acceso a recursos educativos', 'X de Y estudiantes han abierto recursos educativos'); 'Distribución de notas' → 'Distribución de calificaciones' y en general 'notas' → 'calificaciones' en toda la vista docente (pestaña 'Predicción de calificaciones', tooltips, mensajes vacíos; 'Mis notas privadas' del drawer se mantiene porque son anotaciones); 'Cumplimiento evaluativo' → 'Evaluación y Feedback' con el título interno 'Índice de actividades evaluadas y retroalimentadas'; en 'Accesos al curso', 'Entraron...' → 'Ingresaron...'.</w:t>
+        <w:t xml:space="preserve">Renombres de forma en la vista docente (3 ago): KPI 'Nota promedio' → 'Calificación promedio' (donut más grande y centrado verticalmente); 'Elementos publicados' → 'Recursos educativos publicados' ('Tipos de recurso educativo', 'Promedio de acceso a recursos educativos', 'X de Y estudiantes han abierto recursos educativos'); 'Distribución de notas' → 'Distribución de calificaciones' y en general 'notas' → 'calificaciones' en toda la vista docente (pestaña 'Predicción de calificaciones', tooltips, mensajes vacíos; 'Mis notas privadas' del drawer se mantiene porque son anotaciones); 'Cumplimiento evaluativo' → 'Evaluación y Feedback' con el título interno 'Índice de actividades evaluadas y retroalimentadas'; en 'Accesos al curso', 'Entraron...' → 'Ingresaron...', 'Sin entrar hace +14 días' → 'Sin ingresar hace +14 días' y 'Nunca han entrado' → 'Nunca han ingresado'.</w:t>
+      </w:r>
+    </w:p>
+    <w:p>
+      <w:pPr>
+        <w:pStyle w:val="ListParagraph"/>
+        <w:numPr>
+          <w:ilvl w:val="0"/>
+          <w:numId w:val="2"/>
+        </w:numPr>
+      </w:pPr>
+      <w:r>
+        <w:t xml:space="preserve">Rama única de trabajo 'desarrollo' (3 ago): se eliminaron las ~33 ramas por-cambio ya mergeadas (en produccion y origin) y desde ahora todo cambio se commitea en la rama reutilizable 'desarrollo', que se pushea a ambos remotes y desde la cual se abre el PR a main; tras cada merge NO se borra — se reutiliza para el siguiente cambio.</w:t>
       </w:r>
     </w:p>
     <w:p>

</xml_diff>

<commit_message>
docs: actualiza la vista de estudiante, documenta el caso de workflow en Queued y la visibilidad del repo
- Reescribe la descripción de la vista de estudiante (sección 1) al diseño de agosto: tarjetas 'Mi nota actual' y 'Mis asignaciones' con desplegables, calendario bajo RA y 'Notas de mis asignaciones'.
- Agrega al troubleshooting de CI/CD el caso del run que queda en 'Queued' sin arrancar (run #37 del 6 ago, incidente crítico de GitHub Actions ese día): cómo diagnosticarlo y relanzarlo.
- Corrige la visibilidad del repo principal: es PÚBLICO (verificado vía API); se deja nota para confirmar si debe volver a privado.
- Regenera el Word con los tres cambios.

Co-Authored-By: Claude Fable 5 <noreply@anthropic.com>
</commit_message>
<xml_diff>
--- a/docs/Gemelo-Digital-Documentacion-Completa.docx
+++ b/docs/Gemelo-Digital-Documentacion-Completa.docx
@@ -2272,7 +2272,7 @@
           <w:b/>
           <w:bCs/>
         </w:rPr>
-        <w:t xml:space="preserve">Vista de estudiante</w:t>
+        <w:t xml:space="preserve">Vista de estudiante (rediseñada en agosto 2026)</w:t>
       </w:r>
     </w:p>
     <w:p>
@@ -2284,7 +2284,7 @@
         </w:numPr>
       </w:pPr>
       <w:r>
-        <w:t xml:space="preserve">Portal personal con todos sus cursos.</w:t>
+        <w:t xml:space="preserve">Tarjeta 'Mi nota actual' — anillo circular con la nota general del curso en escala 0-10, coloreado según umbrales.</w:t>
       </w:r>
     </w:p>
     <w:p>
@@ -2296,7 +2296,7 @@
         </w:numPr>
       </w:pPr>
       <w:r>
-        <w:t xml:space="preserve">Mis cursos y su rendimiento individual.</w:t>
+        <w:t xml:space="preserve">Tarjeta 'Mis asignaciones' — % de asignaciones entregadas (sobre el total) y % calificadas (sobre las entregadas), cada una con barra y desplegable 'Ver cuáles': entregadas con fecha, calificadas con nota, y pendientes por entregar (rojo si vencen en menos de 7 días).</w:t>
       </w:r>
     </w:p>
     <w:p>
@@ -2308,7 +2308,7 @@
         </w:numPr>
       </w:pPr>
       <w:r>
-        <w:t xml:space="preserve">Cortes y evidencias vencidas.</w:t>
+        <w:t xml:space="preserve">Mis Resultados de Aprendizaje — anillo por RA con estado y la explicación de cada resultado.</w:t>
       </w:r>
     </w:p>
     <w:p>
@@ -2320,7 +2320,7 @@
         </w:numPr>
       </w:pPr>
       <w:r>
-        <w:t xml:space="preserve">Calendario personal con fechas de entrega.</w:t>
+        <w:t xml:space="preserve">Calendario 'Mis próximas entregas' debajo de RA — borde rojo si vence en 7 días o menos.</w:t>
       </w:r>
     </w:p>
     <w:p>
@@ -2332,7 +2332,19 @@
         </w:numPr>
       </w:pPr>
       <w:r>
-        <w:t xml:space="preserve">Proyección explicada — predicción de nota final con explicación.</w:t>
+        <w:t xml:space="preserve">'Notas de mis asignaciones' — gráfica de evolución + tabla de evidencias calificadas.</w:t>
+      </w:r>
+    </w:p>
+    <w:p>
+      <w:pPr>
+        <w:pStyle w:val="ListParagraph"/>
+        <w:numPr>
+          <w:ilvl w:val="0"/>
+          <w:numId w:val="2"/>
+        </w:numPr>
+      </w:pPr>
+      <w:r>
+        <w:t xml:space="preserve">Proyección explicada — predicción de nota final con explicación; prescripción del docente y ruta de mejora.</w:t>
       </w:r>
     </w:p>
     <w:p>
@@ -5266,7 +5278,7 @@
           </w:tcPr>
           <w:p>
             <w:r>
-              <w:t xml:space="preserve">Privado (solo invitados ven el código)</w:t>
+              <w:t xml:space="preserve">PÚBLICO (verificado 7 ago 2026 vía API de GitHub; antes se documentó como privado — confirmar con el dueño si debe volver a privado)</w:t>
             </w:r>
           </w:p>
         </w:tc>
@@ -15761,6 +15773,18 @@
       </w:pPr>
       <w:r>
         <w:t xml:space="preserve">Si falla en "aws ecs wait": el container nuevo no arrancó bien. Mirá CloudWatch Logs del servicio para ver qué error tuvo.</w:t>
+      </w:r>
+    </w:p>
+    <w:p>
+      <w:pPr>
+        <w:pStyle w:val="ListParagraph"/>
+        <w:numPr>
+          <w:ilvl w:val="0"/>
+          <w:numId w:val="2"/>
+        </w:numPr>
+      </w:pPr>
+      <w:r>
+        <w:t xml:space="preserve">Si el run se queda en "Queued" y nunca arranca (caso real: run #37 del frontend, 6 ago 2026): GitHub nunca le asignó el job (al abrirlo no aparece ningún paso). Causa típica: incidente de GitHub Actions en ese momento — verificar en https://www.githubstatus.com. GitHub NO re-agenda solo esos runs y un job en cola sin runner se descarta a las 24 h. Solución: abrir el run → "Cancel workflow", y relanzar con "Re-run all jobs" o con Actions → el workflow → "Run workflow" (rama main).</w:t>
       </w:r>
     </w:p>
     <w:p>

</xml_diff>

<commit_message>
docs: documenta el error de chunks tras deploy y el nuevo sync de S3 en dos pasos
- Agrega al troubleshooting el caso 'error loading dynamically imported module' con su causa (index.html cacheado + chunks renombrados) y la triple protección aplicada.
- Actualiza la descripción del workflow del frontend y el procedimiento de deploy manual: sync de assets sin --delete con cache inmutable e index.html con no-cache.
- Regenera el Word.

Co-Authored-By: Claude Fable 5 <noreply@anthropic.com>
</commit_message>
<xml_diff>
--- a/docs/Gemelo-Digital-Documentacion-Completa.docx
+++ b/docs/Gemelo-Digital-Documentacion-Completa.docx
@@ -15379,7 +15379,7 @@
           </w:tcPr>
           <w:p>
             <w:r>
-              <w:t xml:space="preserve">aws s3 sync con --delete sube los archivos nuevos y borra los que ya no existen</w:t>
+              <w:t xml:space="preserve">Dos pasos (desde el 7 ago 2026): dist/assets/ SIN --delete y con cache inmutable (los chunks de deploys anteriores se conservan para no romper navegadores con el index.html viejo), y el resto (index.html...) con no-cache para que siempre se revalide</w:t>
             </w:r>
           </w:p>
         </w:tc>
@@ -15785,6 +15785,18 @@
       </w:pPr>
       <w:r>
         <w:t xml:space="preserve">Si el run se queda en "Queued" y nunca arranca (caso real: run #37 del frontend, 6 ago 2026): GitHub nunca le asignó el job (al abrirlo no aparece ningún paso). Causa típica: incidente de GitHub Actions en ese momento — verificar en https://www.githubstatus.com. GitHub NO re-agenda solo esos runs y un job en cola sin runner se descarta a las 24 h. Solución: abrir el run → "Cancel workflow", y relanzar con "Re-run all jobs" o con Actions → el workflow → "Run workflow" (rama main).</w:t>
+      </w:r>
+    </w:p>
+    <w:p>
+      <w:pPr>
+        <w:pStyle w:val="ListParagraph"/>
+        <w:numPr>
+          <w:ilvl w:val="0"/>
+          <w:numId w:val="2"/>
+        </w:numPr>
+      </w:pPr>
+      <w:r>
+        <w:t xml:space="preserve">Si tras un deploy los usuarios ven "error loading dynamically imported module: .../assets/....js" (caso real: 7 ago 2026 en el iframe LTI de Brightspace): el navegador tenía cacheado el index.html anterior, que pide chunks JS con hash viejo. Desde el 7 ago hay triple protección: los assets de deploys anteriores ya no se borran, index.html va con no-cache, y el frontend se recarga solo una vez al detectar el fallo (vite:preloadError). Si aun así aparece: Ctrl+Shift+R.</w:t>
       </w:r>
     </w:p>
     <w:p>
@@ -16818,7 +16830,7 @@
         <w:spacing w:after="120"/>
       </w:pPr>
       <w:r>
-        <w:t xml:space="preserve">Sincroniza la carpeta dist/ con el bucket S3. La opción --delete borra del bucket archivos que ya no existen en dist/:</w:t>
+        <w:t xml:space="preserve">Sincroniza la carpeta dist/ con el bucket S3 en dos pasos, igual que el workflow (NO usar --delete: borraría los chunks de deploys anteriores y rompería a los navegadores que aún tienen el index.html viejo):</w:t>
       </w:r>
     </w:p>
     <w:p>
@@ -16832,7 +16844,21 @@
           <w:sz w:val="18"/>
           <w:szCs w:val="18"/>
         </w:rPr>
-        <w:t xml:space="preserve">aws s3 sync ./dist/ s3://gemelo-frontend-prod --delete --region us-east-1</w:t>
+        <w:t xml:space="preserve">aws s3 sync ./dist/assets/ s3://gemelo-frontend-prod/assets/ --cache-control "public,max-age=31536000,immutable" --region us-east-1</w:t>
+      </w:r>
+    </w:p>
+    <w:p>
+      <w:pPr>
+        <w:shd w:fill="F4F4F4" w:val="clear"/>
+        <w:spacing w:after="120"/>
+      </w:pPr>
+      <w:r>
+        <w:rPr>
+          <w:rFonts w:ascii="Consolas" w:cs="Consolas" w:eastAsia="Consolas" w:hAnsi="Consolas"/>
+          <w:sz w:val="18"/>
+          <w:szCs w:val="18"/>
+        </w:rPr>
+        <w:t xml:space="preserve">aws s3 sync ./dist/ s3://gemelo-frontend-prod --exclude "assets/*" --cache-control "no-cache" --region us-east-1</w:t>
       </w:r>
     </w:p>
     <w:p>

</xml_diff>

<commit_message>
fix(dashboard): cuenta todos los recursos educativos visibles del curso
- Elimina el filtro por fecha del conteo de "Recursos educativos
  publicados": se descartaban los recursos con LastModifiedDate
  anterior al inicio del curso, y el material cargado con antelacion
  (aula preparada o copiada antes del semestre) desaparecia del conteo
  — un curso con 5+ PDFs, imagen y enlaces mostraba "1 PDF".
- Cuenta ahora todos los recursos visibles del curso (los ocultos
  siguen excluidos) y calcula el desglose por tipo (PDF, Word, Excel,
  Imagenes, Audios, Videos, HTML, Enlace, Otros) sobre esa misma base,
  de modo que el desglose siempre suma el total.
- Actualiza el tooltip de la tarjeta: "todos los recursos visibles en
  los modulos de contenido del curso... sin importar cuando se
  cargaron".
- Actualiza la documentacion (md + generador docx + Word regenerado)
  con el fix del conteo.

Co-Authored-By: Claude Fable 5 <noreply@anthropic.com>
</commit_message>
<xml_diff>
--- a/docs/Gemelo-Digital-Documentacion-Completa.docx
+++ b/docs/Gemelo-Digital-Documentacion-Completa.docx
@@ -23221,6 +23221,18 @@
       </w:pPr>
       <w:r>
         <w:t xml:space="preserve">Renombres de forma en la vista docente (3 ago): KPI 'Nota promedio' → 'Calificación promedio' (donut más grande y centrado verticalmente); 'Elementos publicados' → 'Recursos educativos publicados' ('Tipos de recurso educativo', 'Promedio de acceso a recursos educativos', 'X de Y estudiantes han abierto recursos educativos'); 'Distribución de notas' → 'Distribución de calificaciones' y en general 'notas' → 'calificaciones' en toda la vista docente (pestaña 'Predicción de calificaciones', tooltips, mensajes vacíos; 'Mis notas privadas' del drawer se mantiene porque son anotaciones); 'Cumplimiento evaluativo' → 'Evaluación y Feedback' con el título interno 'Índice de actividades evaluadas y retroalimentadas'; en 'Accesos al curso', 'Entraron...' → 'Ingresaron...', 'Sin entrar hace +14 días' → 'Sin ingresar hace +14 días' y 'Nunca han entrado' → 'Nunca han ingresado'.</w:t>
+      </w:r>
+    </w:p>
+    <w:p>
+      <w:pPr>
+        <w:pStyle w:val="ListParagraph"/>
+        <w:numPr>
+          <w:ilvl w:val="0"/>
+          <w:numId w:val="2"/>
+        </w:numPr>
+      </w:pPr>
+      <w:r>
+        <w:t xml:space="preserve">Fix del conteo de recursos educativos (10 ago): la tarjeta 'Recursos educativos publicados' descartaba los recursos con LastModifiedDate anterior al inicio del curso — el material cargado con antelación desaparecía del conteo y un curso con 5+ PDFs mostraba '1 PDF'. Ahora cuenta todos los recursos visibles del curso (ocultos excluidos), con el desglose por tipo (PDF, Word, Excel, Imágenes, Audios, Videos, HTML, Enlace, Otros) sobre esa misma base.</w:t>
       </w:r>
     </w:p>
     <w:p>

</xml_diff>

<commit_message>
style(dashboard): hace excluyentes los grupos de accesos al curso
- Cambia "Ingresaron en los ultimos 7 dias" por "Ingresaron entre ayer
  y hace 7 dias": ya no incluye a los que ingresaron hoy, que tienen su
  propio renglon — antes un mismo estudiante contaba en ambos grupos y
  la lectura confundia.
- Deja los cuatro buckets excluyentes (hoy / entre ayer y hace 7 dias /
  +7 dias / nunca): cada estudiante cae en uno solo y los porcentajes
  de la tarjeta suman 100%.
- Actualiza la documentacion (md + generador docx + Word regenerado)
  con los grupos excluyentes.

Co-Authored-By: Claude Fable 5 <noreply@anthropic.com>
</commit_message>
<xml_diff>
--- a/docs/Gemelo-Digital-Documentacion-Completa.docx
+++ b/docs/Gemelo-Digital-Documentacion-Completa.docx
@@ -23221,6 +23221,18 @@
       </w:pPr>
       <w:r>
         <w:t xml:space="preserve">Renombres de forma en la vista docente (3 ago): KPI 'Nota promedio' → 'Calificación promedio' (donut más grande y centrado verticalmente); 'Elementos publicados' → 'Recursos educativos publicados' ('Tipos de recurso educativo', 'Promedio de acceso a recursos educativos', 'X de Y estudiantes han abierto recursos educativos'); 'Distribución de notas' → 'Distribución de calificaciones' y en general 'notas' → 'calificaciones' en toda la vista docente (pestaña 'Predicción de calificaciones', tooltips, mensajes vacíos; 'Mis notas privadas' del drawer se mantiene porque son anotaciones); 'Cumplimiento evaluativo' → 'Evaluación y Feedback' con el título interno 'Índice de actividades evaluadas y retroalimentadas'; en 'Accesos al curso', 'Entraron...' → 'Ingresaron...', 'Sin entrar hace +14 días' → 'Sin ingresar hace +14 días' y 'Nunca han entrado' → 'Nunca han ingresado'.</w:t>
+      </w:r>
+    </w:p>
+    <w:p>
+      <w:pPr>
+        <w:pStyle w:val="ListParagraph"/>
+        <w:numPr>
+          <w:ilvl w:val="0"/>
+          <w:numId w:val="2"/>
+        </w:numPr>
+      </w:pPr>
+      <w:r>
+        <w:t xml:space="preserve">Buckets de accesos excluyentes (10 ago): 'Ingresaron en los últimos 7 días' incluía también a los de hoy, duplicando la lectura con 'Ingresaron hoy'. Ahora los cuatro grupos son excluyentes — hoy / entre ayer y hace 7 días / +7 días / nunca — cada estudiante cae en uno solo y los porcentajes suman 100%.</w:t>
       </w:r>
     </w:p>
     <w:p>

</xml_diff>

<commit_message>
docs: regenera el Word y fija la regla de titulo corto en los PR
- agrega al Word y al markdown el recuento afinado de recursos educativos (enlaces de páginas y de unidades, dedupe, tooltips resumidos)
- fija la convención: título de commit ≤72 caracteres y PR con título y descripción por aparte (un título largo se trunca y se mezcla al autollenar el PR)
- corrige la nota del encabezado: el Word se regenera en cada cambio con node docs/build/generate-docx.js

Co-Authored-By: Claude Fable 5 <noreply@anthropic.com>
</commit_message>
<xml_diff>
--- a/docs/Gemelo-Digital-Documentacion-Completa.docx
+++ b/docs/Gemelo-Digital-Documentacion-Completa.docx
@@ -6752,6 +6752,18 @@
     </w:p>
     <w:p>
       <w:pPr>
+        <w:pStyle w:val="ListParagraph"/>
+        <w:numPr>
+          <w:ilvl w:val="0"/>
+          <w:numId w:val="2"/>
+        </w:numPr>
+      </w:pPr>
+      <w:r>
+        <w:t xml:space="preserve">Título y descripción SIEMPRE por aparte (regla desde el 18 ago 2026): el título del commit debe ser corto (máx. 72 caracteres) — si es más largo, GitHub lo trunca al autollenar el PR y arrastra el resto al campo de título, dejándolo incompleto y mezclado con la descripción. Al abrir el PR, verificar que el campo Title tenga solo la línea del título y que las viñetas queden en el campo Description; si el autollenado los mezcló, separarlos a mano.</w:t>
+      </w:r>
+    </w:p>
+    <w:p>
+      <w:pPr>
         <w:spacing w:after="120"/>
       </w:pPr>
       <w:r>
@@ -23245,6 +23257,18 @@
       </w:pPr>
       <w:r>
         <w:t xml:space="preserve">Lenguaje sencillo en textos y tooltips (11 ago): se eliminó la jerga técnica de los textos visibles del dashboard docente — nada de 'dropbox', 'gradebook', 'classlist' ni nombres de variables; ahora se habla de 'asignaciones publicadas', 'actividades calificables', 'último ingreso', etc. El vacío de Asignaciones pasó a 'Este curso no tiene asignaciones publicadas. Cuando publiques asignaciones en Brightspace aparecerán aquí…'. Convención fija: los textos del usuario final no llevan términos técnicos ni nombres de variables.</w:t>
+      </w:r>
+    </w:p>
+    <w:p>
+      <w:pPr>
+        <w:pStyle w:val="ListParagraph"/>
+        <w:numPr>
+          <w:ilvl w:val="0"/>
+          <w:numId w:val="2"/>
+        </w:numPr>
+      </w:pPr>
+      <w:r>
+        <w:t xml:space="preserve">Recuento y tipos de recursos educativos afinados (18 ago): en la tarjeta 'Recursos educativos publicados', 'HTML' es únicamente las páginas creadas dentro de Brightspace ('Crear nuevo → Página'); un enlace publicado como recurso que lleva a una página web cuenta como 'Enlace' aunque su URL termine en .html, y si lleva a un archivo (PDF, Word, Excel…) cuenta por su tipo de archivo. Los módulos ('Nueva unidad') nunca cuentan como recurso — solo lo que hay dentro. Además ahora también se cuentan: los archivos enlazados dentro de una página (el endpoint /content/topics descarga el HTML de cada página interna y devuelve sus enlaces como EmbeddedLinks; una página con 7 PDFs enlazados suma la página y los 7 PDFs; los enlaces a sitios web escritos dentro de una página no se cuentan) y los enlaces publicados en la descripción de las unidades (moduleLinks: a un archivo cuentan por su tipo y a una página web como 'Enlace'). Dedupe global: un mismo destino enlazado en varias páginas/unidades, o publicado además como recurso propio, cuenta una sola vez. La clasificación vive en utils/helpers.js (contentTypeLabel, fileTypeFromUrl, countEducationalResources) con tests de vitest, y el extractor del backend (_extract_hrefs) tiene tests de pytest. Los tooltips de la tarjeta quedaron cortos y sin ejemplos (convención: tooltips resumidos). Limitación: Brightspace no registra la apertura de archivos enlazados dentro de una página o unidad, así que las barras de consumo miden solo los recursos del árbol de contenido.</w:t>
       </w:r>
     </w:p>
     <w:p>

</xml_diff>

<commit_message>
fix(dashboard): reconoce enlaces sin extension y oculta el ritmo
- reconoce el tipo de archivo en enlaces compartidos de OneDrive/SharePoint (:b: PDF, :w: Word, :x: Excel, :i: imagen, :v: video), que no llevan extensión en la URL
- resuelve los enlaces internos de Brightspace a recursos del propio curso (viewContent y lessons/topics) al recurso real: si es visible no se cuenta doble y si está oculto cuenta por su tipo
- oculta por ahora el subtítulo "Mínimo esperado: N" y la insignia de ritmo de la tarjeta "Recursos educativos publicados" tras el interruptor SHOW_CONTENT_RHYTHM (el cálculo queda intacto para reactivarlo cuando se requiera)
- agrega tests de vitest para los enlaces compartidos y los internos
- actualiza la documentación (markdown, generate-docx.js y Word regenerado)

Co-Authored-By: Claude Fable 5 <noreply@anthropic.com>
</commit_message>
<xml_diff>
--- a/docs/Gemelo-Digital-Documentacion-Completa.docx
+++ b/docs/Gemelo-Digital-Documentacion-Completa.docx
@@ -23269,6 +23269,18 @@
       </w:pPr>
       <w:r>
         <w:t xml:space="preserve">Recuento y tipos de recursos educativos afinados (18 ago): en la tarjeta 'Recursos educativos publicados', 'HTML' es únicamente las páginas creadas dentro de Brightspace ('Crear nuevo → Página'); un enlace publicado como recurso que lleva a una página web cuenta como 'Enlace' aunque su URL termine en .html, y si lleva a un archivo (PDF, Word, Excel…) cuenta por su tipo de archivo. Los módulos ('Nueva unidad') nunca cuentan como recurso — solo lo que hay dentro. Además ahora también se cuentan: los archivos enlazados dentro de una página (el endpoint /content/topics descarga el HTML de cada página interna y devuelve sus enlaces como EmbeddedLinks; una página con 7 PDFs enlazados suma la página y los 7 PDFs; los enlaces a sitios web escritos dentro de una página no se cuentan) y los enlaces publicados en la descripción de las unidades (moduleLinks: a un archivo cuentan por su tipo y a una página web como 'Enlace'). Dedupe global: un mismo destino enlazado en varias páginas/unidades, o publicado además como recurso propio, cuenta una sola vez. La clasificación vive en utils/helpers.js (contentTypeLabel, fileTypeFromUrl, countEducationalResources) con tests de vitest, y el extractor del backend (_extract_hrefs) tiene tests de pytest. Los tooltips de la tarjeta quedaron cortos y sin ejemplos (convención: tooltips resumidos). Limitación: Brightspace no registra la apertura de archivos enlazados dentro de una página o unidad, así que las barras de consumo miden solo los recursos del árbol de contenido.</w:t>
+      </w:r>
+    </w:p>
+    <w:p>
+      <w:pPr>
+        <w:pStyle w:val="ListParagraph"/>
+        <w:numPr>
+          <w:ilvl w:val="0"/>
+          <w:numId w:val="2"/>
+        </w:numPr>
+      </w:pPr>
+      <w:r>
+        <w:t xml:space="preserve">Ritmo de publicación oculto y enlaces a archivos sin extensión (18 ago, 2ª ronda): en la tarjeta 'Recursos educativos publicados' se ocultan por ahora el subtítulo 'Mínimo esperado: N' y la insignia de ritmo (Óptimo / En seguimiento / Crítico) — el cálculo sigue intacto detrás del interruptor SHOW_CONTENT_RHYTHM = false en TeacherDashboard.jsx; ponerlo en true para volver a mostrarlos cuando se requiera. Además el conteo reconoce enlaces a archivos que no llevan extensión en la URL: enlaces compartidos de OneDrive/SharePoint (el tipo va codificado en la ruta: :b: PDF, :w: Word, :x: Excel, :i: imagen, :v: video) y enlaces internos de Brightspace a recursos del propio curso (viewContent / lessons/topics), que se resuelven al recurso real por su Id — si el recurso es visible no se cuenta doble y si está oculto cuenta por su tipo real.</w:t>
       </w:r>
     </w:p>
     <w:p>

</xml_diff>

<commit_message>
fix(dashboard): compara los quicklinks por su URL completa al contar
- corrige el dedupe del conteo de recursos: los quicklinks comparten todos la misma ruta y el recurso va en el query (fileId), así que compararlos sin query descartaba como "ya contados" todos los quicklinks de las unidades cuando el árbol tenía un recurso-quicklink (caso real: 7 PDFs de una unidad no aparecían y la tarjeta decía 1 PDF en vez de 8)
- agrega tests de vitest que reproducen el caso real (7 quicklinks a PDF + recurso-quicklink en el árbol) y el dedupe por URL completa
- registra el diagnóstico y el fix en la documentación (markdown y Word regenerado)

Co-Authored-By: Claude Fable 5 <noreply@anthropic.com>
</commit_message>
<xml_diff>
--- a/docs/Gemelo-Digital-Documentacion-Completa.docx
+++ b/docs/Gemelo-Digital-Documentacion-Completa.docx
@@ -23281,6 +23281,18 @@
       </w:pPr>
       <w:r>
         <w:t xml:space="preserve">Ritmo de publicación oculto y enlaces a archivos sin extensión (18 ago, 2ª ronda): en la tarjeta 'Recursos educativos publicados' se ocultan por ahora el subtítulo 'Mínimo esperado: N' y la insignia de ritmo (Óptimo / En seguimiento / Crítico) — el cálculo sigue intacto detrás del interruptor SHOW_CONTENT_RHYTHM = false en TeacherDashboard.jsx; ponerlo en true para volver a mostrarlos cuando se requiera. Además el conteo reconoce enlaces a archivos que no llevan extensión en la URL: enlaces compartidos de OneDrive/SharePoint (el tipo va codificado en la ruta: :b: PDF, :w: Word, :x: Excel, :i: imagen, :v: video) y enlaces internos de Brightspace a recursos del propio curso (viewContent / lessons/topics), que se resuelven al recurso real por su Id — si el recurso es visible no se cuenta doble y si está oculto cuenta por su tipo real.</w:t>
+      </w:r>
+    </w:p>
+    <w:p>
+      <w:pPr>
+        <w:pStyle w:val="ListParagraph"/>
+        <w:numPr>
+          <w:ilvl w:val="0"/>
+          <w:numId w:val="2"/>
+        </w:numPr>
+      </w:pPr>
+      <w:r>
+        <w:t xml:space="preserve">Fix del dedupe de quicklinks (18 ago, 3ª ronda): los quicklinks de Brightspace comparten TODOS la misma ruta (/d2l/common/dialogs/quickLink/quickLink.d2l) y el recurso real va en el query (fileId). El dedupe comparaba también la URL sin query, así que si el árbol de contenido tenía un recurso-quicklink, todos los quicklinks publicados en las unidades se descartaban como 'ya contados' (caso real, curso 46267: los 7 PDFs de la unidad 'Juego de roles' no aparecían — la tarjeta decía 1 PDF en vez de 8). Ahora los quicklinks se comparan solo por su URL completa. El diagnóstico se hizo contra el backend de producción con la sesión del navegador: /content/topics ya devolvía los 7 quicklinks en moduleLinks con .pdf en el query — el bug era solo del conteo en el frontend.</w:t>
       </w:r>
     </w:p>
     <w:p>

</xml_diff>

<commit_message>
feat(dashboard): aplica la taxonomia definitiva de tipos de recurso
- agrega la categoría PowerPoint: archivo cargado o enlace que lleve a uno (.ppt/.pptx y :p: de OneDrive/SharePoint), alojado en cualquier parte, igual que PDF, Word y Excel
- limita Audios y Videos a archivos cargados en Brightspace: un video de YouTube o un mp4 externo cuenta como Enlace
- envía a "Otros" las imágenes (deja de ser categoría propia) y los quicklinks a actividades del propio curso (foro, quiz, asignación, encuesta, LTI); como enlace dentro de una página o unidad las actividades no se cuentan
- renombra fileTypeFromUrl a docTypeFromUrl y mediaTypeFromUrl en utils/helpers.js y actualiza el tooltip del desglose
- actualiza los tests de vitest a la taxonomía y agrega casos de PowerPoint, media externa y actividades
- actualiza la documentación (markdown y Word regenerado)

Co-Authored-By: Claude Fable 5 <noreply@anthropic.com>
</commit_message>
<xml_diff>
--- a/docs/Gemelo-Digital-Documentacion-Completa.docx
+++ b/docs/Gemelo-Digital-Documentacion-Completa.docx
@@ -23293,6 +23293,18 @@
       </w:pPr>
       <w:r>
         <w:t xml:space="preserve">Fix del dedupe de quicklinks (18 ago, 3ª ronda): los quicklinks de Brightspace comparten TODOS la misma ruta (/d2l/common/dialogs/quickLink/quickLink.d2l) y el recurso real va en el query (fileId). El dedupe comparaba también la URL sin query, así que si el árbol de contenido tenía un recurso-quicklink, todos los quicklinks publicados en las unidades se descartaban como 'ya contados' (caso real, curso 46267: los 7 PDFs de la unidad 'Juego de roles' no aparecían — la tarjeta decía 1 PDF en vez de 8). Ahora los quicklinks se comparan solo por su URL completa. El diagnóstico se hizo contra el backend de producción con la sesión del navegador: /content/topics ya devolvía los 7 quicklinks en moduleLinks con .pdf en el query — el bug era solo del conteo en el frontend.</w:t>
+      </w:r>
+    </w:p>
+    <w:p>
+      <w:pPr>
+        <w:pStyle w:val="ListParagraph"/>
+        <w:numPr>
+          <w:ilvl w:val="0"/>
+          <w:numId w:val="2"/>
+        </w:numPr>
+      </w:pPr>
+      <w:r>
+        <w:t xml:space="preserve">Taxonomía definitiva de tipos de recurso (18 ago, 4ª ronda): PDF / Word / Excel / PowerPoint (categoría nueva) = archivo cargado o enlace que lleva a uno, alojado en cualquier parte (curso, OneDrive/SharePoint — :p: = PowerPoint —, web externa). Audios / Videos = solo archivos cargados en Brightspace (un video de YouTube o un mp4 externo es un Enlace). Enlace = enlaces a páginas externas. HTML = solo páginas creadas dentro de Brightspace (sin cambio). Otros = todo lo demás: imágenes (dejó de ser categoría propia), zips y los quicklinks a actividades del propio curso (foro, quiz, asignación, encuesta, LTI) — publicados como recurso van a 'Otros' (caso real: el enlace al foro 'El rol del ciudadano' salía como Enlace) y como enlace dentro de una página/unidad no se cuentan. Funciones en utils/helpers.js: docTypeFromUrl y mediaTypeFromUrl reemplazan a fileTypeFromUrl; el tooltip del desglose explica las reglas.</w:t>
       </w:r>
     </w:p>
     <w:p>

</xml_diff>

<commit_message>
feat(ui): agrega tour guiado por las opciones tras el tutorial
- ofrece el tour en una tarjeta al terminar las tarjetas del tutorial de bienvenida, con la opción de aceptarlo o declinarlo
- agrega el componente GuidedTour: resalta cada opción real de la pantalla (foco con el resto oscurecido) y muestra un texto flotante que explica qué es y qué hace, con Anterior/Siguiente/Salir y cierre con Escape
- recorre las 9 pestañas del menú lateral, el buscador de curso por ID, el selector Vista profesor/estudiante y el menú de opciones; los pasos sin elemento visible se saltan solos
- ancla los pasos con atributos data-tour en el sidebar y el topbar, y asegura que el menú lateral esté visible antes de arrancar
- agrega la entrada "Tour de opciones" al menú ⚙️ para relanzarlo cuando se quiera
- actualiza la documentación (markdown y Word regenerado)

Co-Authored-By: Claude Fable 5 <noreply@anthropic.com>
</commit_message>
<xml_diff>
--- a/docs/Gemelo-Digital-Documentacion-Completa.docx
+++ b/docs/Gemelo-Digital-Documentacion-Completa.docx
@@ -23293,6 +23293,18 @@
       </w:pPr>
       <w:r>
         <w:t xml:space="preserve">Fix del dedupe de quicklinks (18 ago, 3ª ronda): los quicklinks de Brightspace comparten TODOS la misma ruta (/d2l/common/dialogs/quickLink/quickLink.d2l) y el recurso real va en el query (fileId). El dedupe comparaba también la URL sin query, así que si el árbol de contenido tenía un recurso-quicklink, todos los quicklinks publicados en las unidades se descartaban como 'ya contados' (caso real, curso 46267: los 7 PDFs de la unidad 'Juego de roles' no aparecían — la tarjeta decía 1 PDF en vez de 8). Ahora los quicklinks se comparan solo por su URL completa. El diagnóstico se hizo contra el backend de producción con la sesión del navegador: /content/topics ya devolvía los 7 quicklinks en moduleLinks con .pdf en el query — el bug era solo del conteo en el frontend.</w:t>
+      </w:r>
+    </w:p>
+    <w:p>
+      <w:pPr>
+        <w:pStyle w:val="ListParagraph"/>
+        <w:numPr>
+          <w:ilvl w:val="0"/>
+          <w:numId w:val="2"/>
+        </w:numPr>
+      </w:pPr>
+      <w:r>
+        <w:t xml:space="preserve">Tour guiado por las opciones (18 ago): al terminar las tarjetas del tutorial de bienvenida aparece una tarjeta que pregunta si el usuario quiere hacer un tour por las opciones. Si acepta, un recorrido va resaltando cada opción real de la pantalla (foco con el resto oscurecido + texto flotante) explicando qué es y qué hace: las 9 pestañas del menú lateral, el buscador de curso por ID, el selector 'Vista profesor / Vista estudiante' y el menú de opciones. Componente GuidedTour en teacher/onboarding.jsx, anclado con atributos data-tour en layout.jsx; los pasos cuyo elemento no está visible se saltan solos, y Escape o 'Salir' cierran el tour. Se puede relanzar cuando se quiera desde el menú ⚙️ → 'Tour de opciones'.</w:t>
       </w:r>
     </w:p>
     <w:p>

</xml_diff>

<commit_message>
sec(frontend): asume estudiante ante un rol desconocido (fail-closed)
- AuthContext: un rol de Brightspace desconocido o vacío se mapea a "student" (antes "instructor", que daba la vista docente por defecto); los defaults del contexto también quedan en estudiante
- roles.js: isInstructorRole pasa de "todo lo que no sea estudiante" a una lista explícita de roles docentes/administrativos
- registra en la documentación (markdown y Word) el refuerzo de seguridad completo y marca eliminado show-refresh-token en la tabla de endpoints

Co-Authored-By: Claude Fable 5 <noreply@anthropic.com>
</commit_message>
<xml_diff>
--- a/docs/Gemelo-Digital-Documentacion-Completa.docx
+++ b/docs/Gemelo-Digital-Documentacion-Completa.docx
@@ -23293,6 +23293,18 @@
       </w:pPr>
       <w:r>
         <w:t xml:space="preserve">Fix del dedupe de quicklinks (18 ago, 3ª ronda): los quicklinks de Brightspace comparten TODOS la misma ruta (/d2l/common/dialogs/quickLink/quickLink.d2l) y el recurso real va en el query (fileId). El dedupe comparaba también la URL sin query, así que si el árbol de contenido tenía un recurso-quicklink, todos los quicklinks publicados en las unidades se descartaban como 'ya contados' (caso real, curso 46267: los 7 PDFs de la unidad 'Juego de roles' no aparecían — la tarjeta decía 1 PDF en vez de 8). Ahora los quicklinks se comparan solo por su URL completa. El diagnóstico se hizo contra el backend de producción con la sesión del navegador: /content/topics ya devolvía los 7 quicklinks en moduleLinks con .pdf en el query — el bug era solo del conteo en el frontend.</w:t>
+      </w:r>
+    </w:p>
+    <w:p>
+      <w:pPr>
+        <w:pStyle w:val="ListParagraph"/>
+        <w:numPr>
+          <w:ilvl w:val="0"/>
+          <w:numId w:val="2"/>
+        </w:numPr>
+      </w:pPr>
+      <w:r>
+        <w:t xml:space="preserve">Refuerzo de seguridad — autorización por curso y fixes de auditoría (18 ago): se auditaron todos los endpoints del backend y la seguridad del frontend. Nuevo app/api/course_auth.py: los endpoints /gemelo/course/{ou}/… ya no se sirven con solo tener sesión — el rol se resuelve con la matrícula real del usuario en ese curso (ClasslistRoleName de Brightspace con su propio token, caché 5 min), fail-closed (rol desconocido jamás escala a profesor). Matriz: overview/students/ra-dashboard/metric-history → solo profesor del curso o superadmin; grade-items/config/learning-outcomes → cualquier matriculado; student/{userId} → profesor/admin o el propio estudiante (cierra también la impersonación no validada). Además: /brightspace/all-courses y /brightspace/courses/enrolled?user_id= (cursos de otro usuario) → solo superadmin; /speech/* exigen sesión y rate limit; los print() del LTI pasaron a logger.debug; se confirmó eliminado /admin/show-refresh-token. Frontend fail-closed: rol desconocido/vacío → 'student' (antes 'instructor'); isInstructorRole con lista explícita de roles docentes. 14 tests nuevos de pytest (54 total). La auditoría verificó sin hallazgos: XSS (DOMPurify), token nunca en URLs, postMessage con origin check, secretos estrictos, CORS restringido, superadmin y /debug protegidos.</w:t>
       </w:r>
     </w:p>
     <w:p>

</xml_diff>